<commit_message>
fix: add Carbone :br(true) formatter for proper DOCX line breaks
Carbone {d.field} inserts raw text — \n chars don't create
line breaks in DOCX. The :br(true) formatter converts \n to
<w:br/> XML elements that Word renders correctly.

Changed all multi-line fields:
- brochure: details → {d.details:br(true)}
- cma-report: comparables, market_trends → :br(true)
- comparison: details → {d.details:br(true)}

Also improved comparison formatting with section separators
(━━━ PROPERTY N ━━━) and emoji labels (💰 📐 ✅ ❌).
</commit_message>
<xml_diff>
--- a/ai-server/templates/cma-report.docx
+++ b/ai-server/templates/cma-report.docx
@@ -105,7 +105,7 @@
           <w:sz w:val="22"/>
           <w:szCs w:val="22"/>
         </w:rPr>
-        <w:t xml:space="preserve">{d.comparables}</w:t>
+        <w:t xml:space="preserve">{d.comparables:br(true)}</w:t>
       </w:r>
     </w:p>
     <w:p>
@@ -143,7 +143,7 @@
           <w:sz w:val="22"/>
           <w:szCs w:val="22"/>
         </w:rPr>
-        <w:t xml:space="preserve">{d.market_trends}</w:t>
+        <w:t xml:space="preserve">{d.market_trends:br(true)}</w:t>
       </w:r>
     </w:p>
     <w:p>

</xml_diff>

<commit_message>
fix: remove invalid :br(true) Carbone formatter
Carbone v3 doesn't have a 'br' formatter — it only has 'or',
'ifEmpty', etc. The :br(true) syntax causes:
  'Formatter br does not exist. Do you mean or?'

Removed from all 3 templates. Multi-line text will render
as a single block without explicit line breaks for now.
Content is preserved — just without paragraph separation.
</commit_message>
<xml_diff>
--- a/ai-server/templates/cma-report.docx
+++ b/ai-server/templates/cma-report.docx
@@ -105,7 +105,7 @@
           <w:sz w:val="22"/>
           <w:szCs w:val="22"/>
         </w:rPr>
-        <w:t xml:space="preserve">{d.comparables:br(true)}</w:t>
+        <w:t xml:space="preserve">{d.comparables}</w:t>
       </w:r>
     </w:p>
     <w:p>
@@ -143,7 +143,7 @@
           <w:sz w:val="22"/>
           <w:szCs w:val="22"/>
         </w:rPr>
-        <w:t xml:space="preserve">{d.market_trends:br(true)}</w:t>
+        <w:t xml:space="preserve">{d.market_trends}</w:t>
       </w:r>
     </w:p>
     <w:p>

</xml_diff>